<commit_message>
Module 1 Materials update
</commit_message>
<xml_diff>
--- a/Module 1/Library Data - Introduction to Excel.docx
+++ b/Module 1/Library Data - Introduction to Excel.docx
@@ -205,7 +205,7 @@
           </mc:Choice>
           <mc:Fallback>
             <w:pict>
-              <v:oval w14:anchorId="28825C4A" id="Oval 2" o:spid="_x0000_s1026" style="position:absolute;margin-left:331.2pt;margin-top:46.35pt;width:31.2pt;height:34.8pt;z-index:251660288;visibility:visible;mso-wrap-style:square;mso-wrap-distance-left:9pt;mso-wrap-distance-top:0;mso-wrap-distance-right:9pt;mso-wrap-distance-bottom:0;mso-position-horizontal:absolute;mso-position-horizontal-relative:text;mso-position-vertical:absolute;mso-position-vertical-relative:text;v-text-anchor:middle" o:gfxdata="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" filled="f" strokecolor="#e97132 [3205]"/>
+              <v:oval w14:anchorId="599DD0BF" id="Oval 2" o:spid="_x0000_s1026" style="position:absolute;margin-left:331.2pt;margin-top:46.35pt;width:31.2pt;height:34.8pt;z-index:251660288;visibility:visible;mso-wrap-style:square;mso-wrap-distance-left:9pt;mso-wrap-distance-top:0;mso-wrap-distance-right:9pt;mso-wrap-distance-bottom:0;mso-position-horizontal:absolute;mso-position-horizontal-relative:text;mso-position-vertical:absolute;mso-position-vertical-relative:text;v-text-anchor:middle" o:gfxdata="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" filled="f" strokecolor="#e97132 [3205]"/>
             </w:pict>
           </mc:Fallback>
         </mc:AlternateContent>
@@ -277,7 +277,7 @@
           </mc:Choice>
           <mc:Fallback>
             <w:pict>
-              <v:shapetype w14:anchorId="2EACE83F" id="_x0000_t32" coordsize="21600,21600" o:spt="32" o:oned="t" path="m,l21600,21600e" filled="f">
+              <v:shapetype w14:anchorId="48CDB83A" id="_x0000_t32" coordsize="21600,21600" o:spt="32" o:oned="t" path="m,l21600,21600e" filled="f">
                 <v:path arrowok="t" fillok="f" o:connecttype="none"/>
                 <o:lock v:ext="edit" shapetype="t"/>
               </v:shapetype>
@@ -709,11 +709,9 @@
       <w:r>
         <w:t>Use the data “</w:t>
       </w:r>
-      <w:proofErr w:type="spellStart"/>
       <w:r>
         <w:t>library_data</w:t>
       </w:r>
-      <w:proofErr w:type="spellEnd"/>
       <w:r>
         <w:t>”</w:t>
       </w:r>
@@ -869,7 +867,7 @@
           </mc:Choice>
           <mc:Fallback>
             <w:pict>
-              <v:rect w14:anchorId="4444877B" id="Rectangle 3" o:spid="_x0000_s1026" style="position:absolute;margin-left:366.6pt;margin-top:59.15pt;width:10.8pt;height:10.8pt;z-index:251662336;visibility:visible;mso-wrap-style:square;mso-wrap-distance-left:9pt;mso-wrap-distance-top:0;mso-wrap-distance-right:9pt;mso-wrap-distance-bottom:0;mso-position-horizontal:absolute;mso-position-horizontal-relative:text;mso-position-vertical:absolute;mso-position-vertical-relative:text;v-text-anchor:middle" o:gfxdata="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" filled="f" strokecolor="#e97132 [3205]">
+              <v:rect w14:anchorId="6E7CB156" id="Rectangle 3" o:spid="_x0000_s1026" style="position:absolute;margin-left:366.6pt;margin-top:59.15pt;width:10.8pt;height:10.8pt;z-index:251662336;visibility:visible;mso-wrap-style:square;mso-wrap-distance-left:9pt;mso-wrap-distance-top:0;mso-wrap-distance-right:9pt;mso-wrap-distance-bottom:0;mso-position-horizontal:absolute;mso-position-horizontal-relative:text;mso-position-vertical:absolute;mso-position-vertical-relative:text;v-text-anchor:middle" o:gfxdata="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" filled="f" strokecolor="#e97132 [3205]">
                 <v:stroke joinstyle="round"/>
               </v:rect>
             </w:pict>
@@ -1020,7 +1018,6 @@
       <w:r>
         <w:t xml:space="preserve">, then check only the box for your unique identifier, such as </w:t>
       </w:r>
-      <w:proofErr w:type="spellStart"/>
       <w:r>
         <w:rPr>
           <w:b/>
@@ -1028,11 +1025,9 @@
         </w:rPr>
         <w:t>user_id</w:t>
       </w:r>
-      <w:proofErr w:type="spellEnd"/>
       <w:r>
         <w:t xml:space="preserve"> or </w:t>
       </w:r>
-      <w:proofErr w:type="spellStart"/>
       <w:r>
         <w:rPr>
           <w:b/>
@@ -1040,7 +1035,6 @@
         </w:rPr>
         <w:t>book_id</w:t>
       </w:r>
-      <w:proofErr w:type="spellEnd"/>
       <w:r>
         <w:t>.</w:t>
       </w:r>
@@ -1250,6 +1244,48 @@
       <w:pPr>
         <w:pStyle w:val="ListParagraph"/>
       </w:pPr>
+      <w:r>
+        <w:drawing>
+          <wp:inline distT="0" distB="0" distL="0" distR="0" wp14:anchorId="5E6D87E9" wp14:editId="2B03EFB4">
+            <wp:extent cx="5685013" cy="5273497"/>
+            <wp:effectExtent l="0" t="0" r="0" b="3810"/>
+            <wp:docPr id="2048308942" name="Picture 1"/>
+            <wp:cNvGraphicFramePr>
+              <a:graphicFrameLocks xmlns:a="http://schemas.openxmlformats.org/drawingml/2006/main" noChangeAspect="1"/>
+            </wp:cNvGraphicFramePr>
+            <a:graphic xmlns:a="http://schemas.openxmlformats.org/drawingml/2006/main">
+              <a:graphicData uri="http://schemas.openxmlformats.org/drawingml/2006/picture">
+                <pic:pic xmlns:pic="http://schemas.openxmlformats.org/drawingml/2006/picture">
+                  <pic:nvPicPr>
+                    <pic:cNvPr id="2048308942" name=""/>
+                    <pic:cNvPicPr/>
+                  </pic:nvPicPr>
+                  <pic:blipFill>
+                    <a:blip r:embed="rId14"/>
+                    <a:stretch>
+                      <a:fillRect/>
+                    </a:stretch>
+                  </pic:blipFill>
+                  <pic:spPr>
+                    <a:xfrm>
+                      <a:off x="0" y="0"/>
+                      <a:ext cx="5685013" cy="5273497"/>
+                    </a:xfrm>
+                    <a:prstGeom prst="rect">
+                      <a:avLst/>
+                    </a:prstGeom>
+                  </pic:spPr>
+                </pic:pic>
+              </a:graphicData>
+            </a:graphic>
+          </wp:inline>
+        </w:drawing>
+      </w:r>
+    </w:p>
+    <w:p>
+      <w:pPr>
+        <w:pStyle w:val="ListParagraph"/>
+      </w:pPr>
     </w:p>
     <w:p>
       <w:pPr>
@@ -1332,15 +1368,50 @@
         <w:t>Select the Range:</w:t>
       </w:r>
       <w:r>
-        <w:t xml:space="preserve"> Highlight the range of cells you want Excel to search through (e.g., C2:C500), or type C2:C500 directly. Add a </w:t>
-      </w:r>
-      <w:proofErr w:type="gramStart"/>
-      <w:r>
-        <w:t>comma ,</w:t>
-      </w:r>
-      <w:proofErr w:type="gramEnd"/>
-      <w:r>
-        <w:t xml:space="preserve"> after the range.</w:t>
+        <w:t xml:space="preserve"> Highlight the range of cells you want Excel to search through (e.g., C2:C500), or type C2:C500 directly. Add a comma , after the range.</w:t>
+      </w:r>
+    </w:p>
+    <w:p>
+      <w:pPr>
+        <w:pStyle w:val="ListParagraph"/>
+      </w:pPr>
+      <w:r>
+        <w:lastRenderedPageBreak/>
+        <w:drawing>
+          <wp:inline distT="0" distB="0" distL="0" distR="0" wp14:anchorId="6F270174" wp14:editId="6FA444BC">
+            <wp:extent cx="5731510" cy="3226435"/>
+            <wp:effectExtent l="0" t="0" r="2540" b="0"/>
+            <wp:docPr id="2094323134" name="Picture 1"/>
+            <wp:cNvGraphicFramePr>
+              <a:graphicFrameLocks xmlns:a="http://schemas.openxmlformats.org/drawingml/2006/main" noChangeAspect="1"/>
+            </wp:cNvGraphicFramePr>
+            <a:graphic xmlns:a="http://schemas.openxmlformats.org/drawingml/2006/main">
+              <a:graphicData uri="http://schemas.openxmlformats.org/drawingml/2006/picture">
+                <pic:pic xmlns:pic="http://schemas.openxmlformats.org/drawingml/2006/picture">
+                  <pic:nvPicPr>
+                    <pic:cNvPr id="2094323134" name=""/>
+                    <pic:cNvPicPr/>
+                  </pic:nvPicPr>
+                  <pic:blipFill>
+                    <a:blip r:embed="rId15"/>
+                    <a:stretch>
+                      <a:fillRect/>
+                    </a:stretch>
+                  </pic:blipFill>
+                  <pic:spPr>
+                    <a:xfrm>
+                      <a:off x="0" y="0"/>
+                      <a:ext cx="5731510" cy="3226435"/>
+                    </a:xfrm>
+                    <a:prstGeom prst="rect">
+                      <a:avLst/>
+                    </a:prstGeom>
+                  </pic:spPr>
+                </pic:pic>
+              </a:graphicData>
+            </a:graphic>
+          </wp:inline>
+        </w:drawing>
       </w:r>
     </w:p>
     <w:p>
@@ -1394,15 +1465,7 @@
         <w:t>Complete and Run:</w:t>
       </w:r>
       <w:r>
-        <w:t xml:space="preserve"> Type the closing </w:t>
-      </w:r>
-      <w:proofErr w:type="gramStart"/>
-      <w:r>
-        <w:t>parenthesis )</w:t>
-      </w:r>
-      <w:proofErr w:type="gramEnd"/>
-      <w:r>
-        <w:t xml:space="preserve"> so your full formula looks like </w:t>
+        <w:t xml:space="preserve"> Type the closing parenthesis ) so your full formula looks like </w:t>
       </w:r>
       <m:oMath>
         <m:r>
@@ -1430,19 +1493,94 @@
       <w:pPr>
         <w:pStyle w:val="ListParagraph"/>
       </w:pPr>
-    </w:p>
-    <w:p>
-      <w:pPr>
-        <w:rPr>
-          <w:b/>
-          <w:bCs/>
-        </w:rPr>
-      </w:pPr>
-      <w:r>
-        <w:rPr>
-          <w:b/>
-          <w:bCs/>
-        </w:rPr>
+      <w:r>
+        <w:drawing>
+          <wp:inline distT="0" distB="0" distL="0" distR="0" wp14:anchorId="35E8714E" wp14:editId="07EE83EE">
+            <wp:extent cx="5731510" cy="3010535"/>
+            <wp:effectExtent l="0" t="0" r="2540" b="0"/>
+            <wp:docPr id="658537910" name="Picture 1"/>
+            <wp:cNvGraphicFramePr>
+              <a:graphicFrameLocks xmlns:a="http://schemas.openxmlformats.org/drawingml/2006/main" noChangeAspect="1"/>
+            </wp:cNvGraphicFramePr>
+            <a:graphic xmlns:a="http://schemas.openxmlformats.org/drawingml/2006/main">
+              <a:graphicData uri="http://schemas.openxmlformats.org/drawingml/2006/picture">
+                <pic:pic xmlns:pic="http://schemas.openxmlformats.org/drawingml/2006/picture">
+                  <pic:nvPicPr>
+                    <pic:cNvPr id="658537910" name=""/>
+                    <pic:cNvPicPr/>
+                  </pic:nvPicPr>
+                  <pic:blipFill>
+                    <a:blip r:embed="rId16"/>
+                    <a:stretch>
+                      <a:fillRect/>
+                    </a:stretch>
+                  </pic:blipFill>
+                  <pic:spPr>
+                    <a:xfrm>
+                      <a:off x="0" y="0"/>
+                      <a:ext cx="5731510" cy="3010535"/>
+                    </a:xfrm>
+                    <a:prstGeom prst="rect">
+                      <a:avLst/>
+                    </a:prstGeom>
+                  </pic:spPr>
+                </pic:pic>
+              </a:graphicData>
+            </a:graphic>
+          </wp:inline>
+        </w:drawing>
+      </w:r>
+    </w:p>
+    <w:p>
+      <w:pPr>
+        <w:pStyle w:val="ListParagraph"/>
+      </w:pPr>
+    </w:p>
+    <w:p>
+      <w:pPr>
+        <w:rPr>
+          <w:b/>
+          <w:bCs/>
+        </w:rPr>
+      </w:pPr>
+    </w:p>
+    <w:p>
+      <w:pPr>
+        <w:rPr>
+          <w:b/>
+          <w:bCs/>
+        </w:rPr>
+      </w:pPr>
+    </w:p>
+    <w:p>
+      <w:pPr>
+        <w:rPr>
+          <w:b/>
+          <w:bCs/>
+        </w:rPr>
+      </w:pPr>
+    </w:p>
+    <w:p>
+      <w:pPr>
+        <w:rPr>
+          <w:b/>
+          <w:bCs/>
+        </w:rPr>
+      </w:pPr>
+    </w:p>
+    <w:p>
+      <w:pPr>
+        <w:rPr>
+          <w:b/>
+          <w:bCs/>
+        </w:rPr>
+      </w:pPr>
+      <w:r>
+        <w:rPr>
+          <w:b/>
+          <w:bCs/>
+        </w:rPr>
+        <w:lastRenderedPageBreak/>
         <w:t>Summing Operational Totals</w:t>
       </w:r>
     </w:p>
@@ -1575,13 +1713,8 @@
         <w:t>Select the Criteria Range:</w:t>
       </w:r>
       <w:r>
-        <w:t xml:space="preserve"> Highlight or type the range of cells Excel will evaluate (e.g., A2:A100), then type a </w:t>
-      </w:r>
-      <w:proofErr w:type="gramStart"/>
-      <w:r>
-        <w:t>comma ,</w:t>
-      </w:r>
-      <w:proofErr w:type="gramEnd"/>
+        <w:t xml:space="preserve"> Highlight or type the range of cells Excel will evaluate (e.g., A2:A100), then type a comma ,</w:t>
+      </w:r>
       <w:r>
         <w:t xml:space="preserve"> </w:t>
       </w:r>
@@ -1610,21 +1743,8 @@
         <w:t>Set the Criteria:</w:t>
       </w:r>
       <w:r>
-        <w:t xml:space="preserve"> Enter the specific condition in quotation marks (e.g., "Main Branch"</w:t>
-      </w:r>
-      <w:proofErr w:type="gramStart"/>
-      <w:r>
-        <w:t>), or</w:t>
-      </w:r>
-      <w:proofErr w:type="gramEnd"/>
-      <w:r>
-        <w:t xml:space="preserve"> select a cell containing that text name. Type a </w:t>
-      </w:r>
-      <w:proofErr w:type="gramStart"/>
-      <w:r>
-        <w:t>comma ,</w:t>
-      </w:r>
-      <w:proofErr w:type="gramEnd"/>
+        <w:t xml:space="preserve"> Enter the specific condition in quotation marks (e.g., "Main Branch"), or select a cell containing that text name. Type a comma ,</w:t>
+      </w:r>
       <w:r>
         <w:t xml:space="preserve"> </w:t>
       </w:r>
@@ -1677,15 +1797,7 @@
         <w:t>Complete and Run:</w:t>
       </w:r>
       <w:r>
-        <w:t xml:space="preserve"> Type the closing </w:t>
-      </w:r>
-      <w:proofErr w:type="gramStart"/>
-      <w:r>
-        <w:t>parenthesis )</w:t>
-      </w:r>
-      <w:proofErr w:type="gramEnd"/>
-      <w:r>
-        <w:t xml:space="preserve"> so your formula looks like </w:t>
+        <w:t xml:space="preserve"> Type the closing parenthesis ) so your formula looks like </w:t>
       </w:r>
       <m:oMath>
         <m:r>
@@ -1742,7 +1854,6 @@
           <w:b/>
           <w:bCs/>
         </w:rPr>
-        <w:lastRenderedPageBreak/>
         <w:t>Select Your Data:</w:t>
       </w:r>
       <w:r>
@@ -2002,6 +2113,18 @@
       </w:r>
     </w:p>
     <w:p>
+      <w:r>
+        <w:lastRenderedPageBreak/>
+        <w:t>Use this data “</w:t>
+      </w:r>
+      <w:r>
+        <w:t>Leeds City Council - IT Usage Per Age</w:t>
+      </w:r>
+      <w:r>
+        <w:t>”</w:t>
+      </w:r>
+    </w:p>
+    <w:p>
       <w:pPr>
         <w:pStyle w:val="ListParagraph"/>
         <w:numPr>
@@ -2062,23 +2185,7 @@
           <w:b/>
           <w:bCs/>
         </w:rPr>
-        <w:t>Generate P</w:t>
-      </w:r>
-      <w:proofErr w:type="spellStart"/>
-      <w:r>
-        <w:rPr>
-          <w:b/>
-          <w:bCs/>
-        </w:rPr>
-        <w:t>ivotCharts</w:t>
-      </w:r>
-      <w:proofErr w:type="spellEnd"/>
-      <w:r>
-        <w:rPr>
-          <w:b/>
-          <w:bCs/>
-        </w:rPr>
-        <w:t>:</w:t>
+        <w:t>Generate PivotCharts:</w:t>
       </w:r>
       <w:r>
         <w:t xml:space="preserve"> Insert a PivotChart for each PivotTable (for example, a Column Chart for branch visits or a Line Chart for monthly trends).</w:t>
@@ -2105,15 +2212,7 @@
         <w:t>Layout the Canvas:</w:t>
       </w:r>
       <w:r>
-        <w:t xml:space="preserve"> Add a dedicated "Dashboard" tab, hide the background gridlines, and cut and paste your </w:t>
-      </w:r>
-      <w:proofErr w:type="spellStart"/>
-      <w:r>
-        <w:t>PivotCharts</w:t>
-      </w:r>
-      <w:proofErr w:type="spellEnd"/>
-      <w:r>
-        <w:t xml:space="preserve"> onto this clean sheet.</w:t>
+        <w:t xml:space="preserve"> Add a dedicated "Dashboard" tab, hide the background gridlines, and cut and paste your PivotCharts onto this clean sheet.</w:t>
       </w:r>
     </w:p>
     <w:p>
@@ -2178,18 +2277,13 @@
       <w:r>
         <w:t xml:space="preserve"> </w:t>
       </w:r>
-      <w:proofErr w:type="spellStart"/>
-      <w:r>
-        <w:t>ExcelIsFun</w:t>
-      </w:r>
-      <w:proofErr w:type="spellEnd"/>
-      <w:r>
-        <w:t xml:space="preserve"> (YouTube by Mike Girvin)</w:t>
+      <w:r>
+        <w:t>ExcelIsFun (YouTube by Mike Girvin)</w:t>
       </w:r>
       <w:r>
         <w:t xml:space="preserve"> </w:t>
       </w:r>
-      <w:hyperlink r:id="rId14" w:history="1">
+      <w:hyperlink r:id="rId17" w:history="1">
         <w:r>
           <w:rPr>
             <w:rStyle w:val="Hyperlink"/>

</xml_diff>